<commit_message>
Subir a GitHub todos los ejemplos, infografias, video mp4, audio m4a y guias de NotebookLM
</commit_message>
<xml_diff>
--- a/CLASES/2. INTRODUCCION_NLM/FUENTE_TEMARIO_NLM.docx
+++ b/CLASES/2. INTRODUCCION_NLM/FUENTE_TEMARIO_NLM.docx
@@ -27,7 +27,7 @@
           <w:color w:val="1A0A2E"/>
           <w:sz w:val="30"/>
         </w:rPr>
-        <w:t>DOCUMENTO FUENTE: TEMARIO DE NOTEBOOKLM</w:t>
+        <w:t>DOCUMENTO FUENTE: GUÍA VISUAL DE LA PANTALLA REAL DE NOTEBOOKLM</w:t>
       </w:r>
     </w:p>
     <w:p>
@@ -41,7 +41,7 @@
           <w:color w:val="475569"/>
           <w:sz w:val="20"/>
         </w:rPr>
-        <w:t>📋 Sube este archivo directamente a la sección 'Fuentes' de tu cuaderno de NotebookLM.</w:t>
+        <w:t>📋 Sube este archivo a 'Fuentes' en NotebookLM. Contiene los 12 puntos explicados sobre la pantalla real: Fuentes, Campo Prompt y Panel Studio.</w:t>
       </w:r>
     </w:p>
     <w:tbl>
@@ -76,7 +76,7 @@
                 <w:color w:val="1E293B"/>
                 <w:sz w:val="19"/>
               </w:rPr>
-              <w:t>DOCUMENTO FUENTE: CONTENIDOS DIDÁCTICOS DE NOTEBOOKLM (TU CUADERNO INTELIGENTE)</w:t>
+              <w:t>DOCUMENTO FUENTE: GUÍA VISUAL SOBRE LA PANTALLA REAL DE NOTEBOOKLM</w:t>
             </w:r>
           </w:p>
           <w:p>
@@ -89,7 +89,7 @@
                 <w:color w:val="1E293B"/>
                 <w:sz w:val="19"/>
               </w:rPr>
-              <w:t>Audiencia: Personas mayores de 60 a 75 años sin conocimientos informáticos previos.</w:t>
+              <w:t>Audiencia: Adultos mayores de 60 a 75 años sin experiencia tecnológica.</w:t>
             </w:r>
           </w:p>
           <w:p>
@@ -102,7 +102,7 @@
                 <w:color w:val="1E293B"/>
                 <w:sz w:val="19"/>
               </w:rPr>
-              <w:t>Objetivo: Guía paso a paso para entender NotebookLM, subir documentos propios y generar resúmenes y audios.</w:t>
+              <w:t>Enfoque: Explicación directa sobre la interfaz real de NotebookLM dividida en sus 3 columnas (Fuentes, Chat/Campo Prompt y Panel Studio).</w:t>
             </w:r>
           </w:p>
           <w:p>
@@ -120,7 +120,7 @@
                 <w:color w:val="1E293B"/>
                 <w:sz w:val="19"/>
               </w:rPr>
-              <w:t>DESGLOSE CONTENIDO DIAPOSITIVA A DIAPOSITIVA:</w:t>
+              <w:t>DESGLOSE DIAPOSITIVA A DIAPOSITIVA:</w:t>
             </w:r>
           </w:p>
           <w:p>
@@ -139,7 +139,7 @@
                 <w:color w:val="0F172A"/>
                 <w:sz w:val="19"/>
               </w:rPr>
-              <w:t>DIAPOSITIVA 1: PORTADA</w:t>
+              <w:t>SLIDE 1: PORTADA</w:t>
             </w:r>
           </w:p>
           <w:p>
@@ -165,7 +165,20 @@
                 <w:color w:val="334155"/>
                 <w:sz w:val="19"/>
               </w:rPr>
-              <w:t>- Mensaje: Pon a trabajar a la Inteligencia Artificial con tus propios documentos, recuerdos familiares y recetas. Una biblioteca inteligente que solo lee lo que tú le pides.</w:t>
+              <w:t>- Subtítulo: Conoce tu pantalla real: cómo subir tus papeles, preguntar y escuchar resúmenes en audio.</w:t>
+            </w:r>
+          </w:p>
+          <w:p>
+            <w:pPr>
+              <w:spacing w:line="276" w:lineRule="auto" w:after="40"/>
+            </w:pPr>
+            <w:r>
+              <w:rPr>
+                <w:rFonts w:ascii="Consolas" w:hAnsi="Consolas"/>
+                <w:color w:val="334155"/>
+                <w:sz w:val="19"/>
+              </w:rPr>
+              <w:t>- Visual: Pantalla de ordenador mostrando la interfaz web real y moderna de Google NotebookLM con sus tres columnas.</w:t>
             </w:r>
           </w:p>
           <w:p>
@@ -184,7 +197,7 @@
                 <w:color w:val="0F172A"/>
                 <w:sz w:val="19"/>
               </w:rPr>
-              <w:t>DIAPOSITIVA 2: ¿EN QUÉ SE DIFERENCIA DE GEMINI?</w:t>
+              <w:t>SLIDE 2: ¿EN QUÉ SE DIFERENCIA DE GEMINI?</w:t>
             </w:r>
           </w:p>
           <w:p>
@@ -197,7 +210,7 @@
                 <w:color w:val="334155"/>
                 <w:sz w:val="19"/>
               </w:rPr>
-              <w:t>- Concepto clave: Gemini sabe de todo internet; NotebookLM solo lee los papeles que tú le subes a su mesa.</w:t>
+              <w:t>- Concepto real: Gemini busca en todo internet y puede opinar o equivocarse; NotebookLM es un archivador privado que SOLO lee lo que tú le subes.</w:t>
             </w:r>
           </w:p>
           <w:p>
@@ -210,7 +223,7 @@
                 <w:color w:val="334155"/>
                 <w:sz w:val="19"/>
               </w:rPr>
-              <w:t>- Gran ventaja: NotebookLM no se inventa cosas. Solo responde con la verdad escrita en tus documentos.</w:t>
+              <w:t>- Seguridad absoluta: Si no está en tus papeles, NotebookLM te dice "no aparece en los documentos". Cero invenciones.</w:t>
             </w:r>
           </w:p>
           <w:p>
@@ -223,7 +236,7 @@
                 <w:color w:val="334155"/>
                 <w:sz w:val="19"/>
               </w:rPr>
-              <w:t>- Demostración de rigor: Cada dato que te da incluye una etiqueta con número para que veas la página original exacta de donde lo sacó.</w:t>
+              <w:t>- Visual: Dos pantallas comparadas: el icono de Gemini (web abierta) frente a la carpeta cerrada de NotebookLM (tus propios archivos).</w:t>
             </w:r>
           </w:p>
           <w:p>
@@ -242,7 +255,7 @@
                 <w:color w:val="0F172A"/>
                 <w:sz w:val="19"/>
               </w:rPr>
-              <w:t>DIAPOSITIVA 3: CÓMO ENTRAR A NOTEBOOKLM</w:t>
+              <w:t>SLIDE 3: CÓMO ENTRAR A NOTEBOOKLM</w:t>
             </w:r>
           </w:p>
           <w:p>
@@ -268,7 +281,7 @@
                 <w:color w:val="334155"/>
                 <w:sz w:val="19"/>
               </w:rPr>
-              <w:t>- Identificación: Con tu misma cuenta de Google (Gmail).</w:t>
+              <w:t>- Acceso: Clic en "Iniciar sesión" con tu cuenta habitual de Google (Gmail).</w:t>
             </w:r>
           </w:p>
           <w:p>
@@ -281,7 +294,7 @@
                 <w:color w:val="334155"/>
                 <w:sz w:val="19"/>
               </w:rPr>
-              <w:t>- Sin registros nuevos: Entras directamente con un solo clic porque ya estás identificado en Google.</w:t>
+              <w:t>- Visual: Captura de la pantalla de bienvenida con el botón de inicio de sesión de Google.</w:t>
             </w:r>
           </w:p>
           <w:p>
@@ -300,7 +313,7 @@
                 <w:color w:val="0F172A"/>
                 <w:sz w:val="19"/>
               </w:rPr>
-              <w:t>DIAPOSITIVA 4: LA PANTALLA PRINCIPAL: «TUS CUADERNOS»</w:t>
+              <w:t>SLIDE 4: EL MAPA GENERAL DE LA PANTALLA REAL (LAS 3 COLUMNAS)</w:t>
             </w:r>
           </w:p>
           <w:p>
@@ -313,7 +326,7 @@
                 <w:color w:val="334155"/>
                 <w:sz w:val="19"/>
               </w:rPr>
-              <w:t>- Elemento: El botón central "+ Nuevo cuaderno".</w:t>
+              <w:t>- Columna 1 (Izquierda): Panel de FUENTES (los papeles que le das a leer).</w:t>
             </w:r>
           </w:p>
           <w:p>
@@ -326,7 +339,33 @@
                 <w:color w:val="334155"/>
                 <w:sz w:val="19"/>
               </w:rPr>
-              <w:t>- Metáfora: Un cuaderno es como una carpeta de cartón donde guardas papeles de un mismo tema (ej: "Mis recetas familiares", "Papeles de la casa", "La historia de mi pueblo").</w:t>
+              <w:t>- Columna 2 (Centro): ZONA DE CONVERSACIÓN Y CAMPO PROMPT (donde preguntas y lees las respuestas con citas).</w:t>
+            </w:r>
+          </w:p>
+          <w:p>
+            <w:pPr>
+              <w:spacing w:line="276" w:lineRule="auto" w:after="40"/>
+            </w:pPr>
+            <w:r>
+              <w:rPr>
+                <w:rFonts w:ascii="Consolas" w:hAnsi="Consolas"/>
+                <w:color w:val="334155"/>
+                <w:sz w:val="19"/>
+              </w:rPr>
+              <w:t>- Columna 3 (Derecha): PANEL STUDIO (donde se generan los audios, resúmenes automáticos y guías).</w:t>
+            </w:r>
+          </w:p>
+          <w:p>
+            <w:pPr>
+              <w:spacing w:line="276" w:lineRule="auto" w:after="40"/>
+            </w:pPr>
+            <w:r>
+              <w:rPr>
+                <w:rFonts w:ascii="Consolas" w:hAnsi="Consolas"/>
+                <w:color w:val="334155"/>
+                <w:sz w:val="19"/>
+              </w:rPr>
+              <w:t>- Visual: Captura completa de la interfaz real de NotebookLM con las tres zonas delimitadas y rotuladas.</w:t>
             </w:r>
           </w:p>
           <w:p>
@@ -345,7 +384,7 @@
                 <w:color w:val="0F172A"/>
                 <w:sz w:val="19"/>
               </w:rPr>
-              <w:t>DIAPOSITIVA 5: EL PANEL DE FUENTES: «AÑADIR TUS PAPELES»</w:t>
+              <w:t>SLIDE 5: COLUMNA IZQUIERDA: EL PANEL DE FUENTES («+ AÑADIR FUENTES»)</w:t>
             </w:r>
           </w:p>
           <w:p>
@@ -358,7 +397,7 @@
                 <w:color w:val="334155"/>
                 <w:sz w:val="19"/>
               </w:rPr>
-              <w:t>- Elemento: El panel lateral con el botón "+ Añadir fuentes".</w:t>
+              <w:t>- El botón superior: "+ Añadir fuentes".</w:t>
             </w:r>
           </w:p>
           <w:p>
@@ -371,7 +410,59 @@
                 <w:color w:val="334155"/>
                 <w:sz w:val="19"/>
               </w:rPr>
-              <w:t>- Qué puedes meter: Archivos PDF, fotos de cartas antiguas, documentos de texto o enlaces web.</w:t>
+              <w:t>- Qué formatos admite:</w:t>
+            </w:r>
+          </w:p>
+          <w:p>
+            <w:pPr>
+              <w:spacing w:line="276" w:lineRule="auto" w:after="40"/>
+            </w:pPr>
+            <w:r>
+              <w:rPr>
+                <w:rFonts w:ascii="Consolas" w:hAnsi="Consolas"/>
+                <w:color w:val="1E293B"/>
+                <w:sz w:val="19"/>
+              </w:rPr>
+              <w:t xml:space="preserve">  1. Subir archivos PDF o Word desde tu ordenador.</w:t>
+            </w:r>
+          </w:p>
+          <w:p>
+            <w:pPr>
+              <w:spacing w:line="276" w:lineRule="auto" w:after="40"/>
+            </w:pPr>
+            <w:r>
+              <w:rPr>
+                <w:rFonts w:ascii="Consolas" w:hAnsi="Consolas"/>
+                <w:color w:val="1E293B"/>
+                <w:sz w:val="19"/>
+              </w:rPr>
+              <w:t xml:space="preserve">  2. Enlaces de vídeos de YouTube (lee su transcripción al segundo).</w:t>
+            </w:r>
+          </w:p>
+          <w:p>
+            <w:pPr>
+              <w:spacing w:line="276" w:lineRule="auto" w:after="40"/>
+            </w:pPr>
+            <w:r>
+              <w:rPr>
+                <w:rFonts w:ascii="Consolas" w:hAnsi="Consolas"/>
+                <w:color w:val="1E293B"/>
+                <w:sz w:val="19"/>
+              </w:rPr>
+              <w:t xml:space="preserve">  3. Texto copiado (pegar cartas, recetas o notas manuscritas).</w:t>
+            </w:r>
+          </w:p>
+          <w:p>
+            <w:pPr>
+              <w:spacing w:line="276" w:lineRule="auto" w:after="40"/>
+            </w:pPr>
+            <w:r>
+              <w:rPr>
+                <w:rFonts w:ascii="Consolas" w:hAnsi="Consolas"/>
+                <w:color w:val="1E293B"/>
+                <w:sz w:val="19"/>
+              </w:rPr>
+              <w:t xml:space="preserve">  4. Google Drive.</w:t>
             </w:r>
           </w:p>
           <w:p>
@@ -384,7 +475,7 @@
                 <w:color w:val="334155"/>
                 <w:sz w:val="19"/>
               </w:rPr>
-              <w:t>- El gesto fácil: Arrastrar el documento con el ratón directamente a la pantalla o pulsar "Subir desde el ordenador".</w:t>
+              <w:t>- Las casillas de activación: Puedes marcar o desmarcar qué documentos quieres que tenga en cuenta en cada momento.</w:t>
             </w:r>
           </w:p>
           <w:p>
@@ -403,7 +494,7 @@
                 <w:color w:val="0F172A"/>
                 <w:sz w:val="19"/>
               </w:rPr>
-              <w:t>DIAPOSITIVA 6: EL CHAT INTELIGENTE: «PREGUNTA A TUS PAPELES»</w:t>
+              <w:t>SLIDE 6: COLUMNA CENTRAL: EL CAMPO PROMPT (DÓNDE Y CÓMO ESCRIBIR)</w:t>
             </w:r>
           </w:p>
           <w:p>
@@ -416,7 +507,7 @@
                 <w:color w:val="334155"/>
                 <w:sz w:val="19"/>
               </w:rPr>
-              <w:t>- Elemento: La barra inferior de consulta.</w:t>
+              <w:t>- Elemento visual: El recuadro inferior alargado de texto ("Empieza a escribir...").</w:t>
             </w:r>
           </w:p>
           <w:p>
@@ -429,7 +520,20 @@
                 <w:color w:val="334155"/>
                 <w:sz w:val="19"/>
               </w:rPr>
-              <w:t>- Cómo funciona: Le preguntas en español normal, como si hablaras con un archivador que se ha leído todos tus papeles en tres segundos.</w:t>
+              <w:t>- Cómo usarlo: Escribe tu pregunta con tus propias palabras cotidianas.</w:t>
+            </w:r>
+          </w:p>
+          <w:p>
+            <w:pPr>
+              <w:spacing w:line="276" w:lineRule="auto" w:after="40"/>
+            </w:pPr>
+            <w:r>
+              <w:rPr>
+                <w:rFonts w:ascii="Consolas" w:hAnsi="Consolas"/>
+                <w:color w:val="1E293B"/>
+                <w:sz w:val="19"/>
+              </w:rPr>
+              <w:t xml:space="preserve">  * Ejemplos: "¿Qué día ocurrió el alunizaje según los informes?", "¿Qué receta contiene almendras?", "¿Cuánto dinero costaba el alquiler?".</w:t>
             </w:r>
           </w:p>
           <w:p>
@@ -442,7 +546,7 @@
                 <w:color w:val="334155"/>
                 <w:sz w:val="19"/>
               </w:rPr>
-              <w:t>- Ejemplos: "Dime los ingredientes exactos de la receta de mi abuela" o "¿En qué fecha nos mudamos de casa según las cartas?".</w:t>
+              <w:t>- Envío: Pulsa la flecha o la tecla Enter.</w:t>
             </w:r>
           </w:p>
           <w:p>
@@ -461,7 +565,7 @@
                 <w:color w:val="0F172A"/>
                 <w:sz w:val="19"/>
               </w:rPr>
-              <w:t>DIAPOSITIVA 7: LAS CITAS NUMERADAS: «DEMOSTRACIÓN DE VERDAD»</w:t>
+              <w:t>SLIDE 7: LAS CITAS NUMERADAS [1] (LA PRUEBA DEL ALGODÓN)</w:t>
             </w:r>
           </w:p>
           <w:p>
@@ -474,7 +578,7 @@
                 <w:color w:val="334155"/>
                 <w:sz w:val="19"/>
               </w:rPr>
-              <w:t>- Elemento: Un párrafo de respuesta con pequeños números [1], [2] al final de las frases.</w:t>
+              <w:t>- Elemento visual: El texto de respuesta con pequeños botones grises o azules numerados: [1], [2].</w:t>
             </w:r>
           </w:p>
           <w:p>
@@ -487,7 +591,7 @@
                 <w:color w:val="334155"/>
                 <w:sz w:val="19"/>
               </w:rPr>
-              <w:t>- Utilidad: Al hacer clic sobre el número [1], la pantalla salta automáticamente al párrafo exacto de tu documento donde está escrito.</w:t>
+              <w:t>- La magia de la cita: Al pulsar sobre el número [1], la pantalla se desplaza y subraya el párrafo exacto en tu documento original donde está escrito el dato.</w:t>
             </w:r>
           </w:p>
           <w:p>
@@ -500,7 +604,7 @@
                 <w:color w:val="334155"/>
                 <w:sz w:val="19"/>
               </w:rPr>
-              <w:t>- Tranquilidad: Sabes al 100% que no es una invención de la IA.</w:t>
+              <w:t>- Tranquilidad: El alumno comprueba por sí mismo que la respuesta es 100% verídica y no un invento.</w:t>
             </w:r>
           </w:p>
           <w:p>
@@ -519,7 +623,7 @@
                 <w:color w:val="0F172A"/>
                 <w:sz w:val="19"/>
               </w:rPr>
-              <w:t>DIAPOSITIVA 8: LA GUÍA DEL CUADERNO: ESQUEMAS Y RESÚMENES</w:t>
+              <w:t>SLIDE 8: COLUMNA DERECHA: EL PANEL STUDIO (LA FÁBRICA DE RESÚMENES)</w:t>
             </w:r>
           </w:p>
           <w:p>
@@ -532,7 +636,7 @@
                 <w:color w:val="334155"/>
                 <w:sz w:val="19"/>
               </w:rPr>
-              <w:t>- Elemento: Los botones superiores de "Guía del cuaderno", "Preguntas frecuentes" y "Línea de tiempo".</w:t>
+              <w:t>- Elemento visual: El panel lateral derecho titulado "Studio".</w:t>
             </w:r>
           </w:p>
           <w:p>
@@ -545,7 +649,72 @@
                 <w:color w:val="334155"/>
                 <w:sz w:val="19"/>
               </w:rPr>
-              <w:t>- Utilidad: Te resume automáticamente un documento largo de 20 páginas en 5 puntos clave para que no tengas que leerlo todo de golpe.</w:t>
+              <w:t>- Para qué sirve: Es tu mesa de trabajo para crear contenidos automáticos sin tener que pedirlos uno a uno.</w:t>
+            </w:r>
+          </w:p>
+          <w:p>
+            <w:pPr>
+              <w:spacing w:line="276" w:lineRule="auto" w:after="40"/>
+            </w:pPr>
+            <w:r>
+              <w:rPr>
+                <w:rFonts w:ascii="Consolas" w:hAnsi="Consolas"/>
+                <w:color w:val="334155"/>
+                <w:sz w:val="19"/>
+              </w:rPr>
+              <w:t>- Las herramientas de Studio:</w:t>
+            </w:r>
+          </w:p>
+          <w:p>
+            <w:pPr>
+              <w:spacing w:line="276" w:lineRule="auto" w:after="40"/>
+            </w:pPr>
+            <w:r>
+              <w:rPr>
+                <w:rFonts w:ascii="Consolas" w:hAnsi="Consolas"/>
+                <w:color w:val="1E293B"/>
+                <w:sz w:val="19"/>
+              </w:rPr>
+              <w:t xml:space="preserve">  * Guía del cuaderno (Notebook Guide).</w:t>
+            </w:r>
+          </w:p>
+          <w:p>
+            <w:pPr>
+              <w:spacing w:line="276" w:lineRule="auto" w:after="40"/>
+            </w:pPr>
+            <w:r>
+              <w:rPr>
+                <w:rFonts w:ascii="Consolas" w:hAnsi="Consolas"/>
+                <w:color w:val="1E293B"/>
+                <w:sz w:val="19"/>
+              </w:rPr>
+              <w:t xml:space="preserve">  * Preguntas frecuentes (FAQ automáticas).</w:t>
+            </w:r>
+          </w:p>
+          <w:p>
+            <w:pPr>
+              <w:spacing w:line="276" w:lineRule="auto" w:after="40"/>
+            </w:pPr>
+            <w:r>
+              <w:rPr>
+                <w:rFonts w:ascii="Consolas" w:hAnsi="Consolas"/>
+                <w:color w:val="1E293B"/>
+                <w:sz w:val="19"/>
+              </w:rPr>
+              <w:t xml:space="preserve">  * Cronología / Línea de tiempo de los hechos.</w:t>
+            </w:r>
+          </w:p>
+          <w:p>
+            <w:pPr>
+              <w:spacing w:line="276" w:lineRule="auto" w:after="40"/>
+            </w:pPr>
+            <w:r>
+              <w:rPr>
+                <w:rFonts w:ascii="Consolas" w:hAnsi="Consolas"/>
+                <w:color w:val="1E293B"/>
+                <w:sz w:val="19"/>
+              </w:rPr>
+              <w:t xml:space="preserve">  * Notas fijadas.</w:t>
             </w:r>
           </w:p>
           <w:p>
@@ -564,7 +733,7 @@
                 <w:color w:val="0F172A"/>
                 <w:sz w:val="19"/>
               </w:rPr>
-              <w:t>DIAPOSITIVA 9: LA FUNCIÓN ESTRELLA: EL PROGRAMA DE RADIO (AUDIO OVERVIEW) 🎙️</w:t>
+              <w:t>SLIDE 9: STUDIO: EL RESUMEN DE AUDIO (AUDIO OVERVIEW / PODCAST) 🎙️</w:t>
             </w:r>
           </w:p>
           <w:p>
@@ -577,7 +746,7 @@
                 <w:color w:val="334155"/>
                 <w:sz w:val="19"/>
               </w:rPr>
-              <w:t>- Elemento: El botón "Generar" bajo el apartado de audio.</w:t>
+              <w:t>- Elemento visual: El botón destacado "Generar" bajo el apartado de Audio en Studio.</w:t>
             </w:r>
           </w:p>
           <w:p>
@@ -590,7 +759,7 @@
                 <w:color w:val="334155"/>
                 <w:sz w:val="19"/>
               </w:rPr>
-              <w:t>- La magia: La IA crea una tertulia de radio en español entre dos locutores simpáticos que comentan y explican tus documentos como en una charla de sobremesa.</w:t>
+              <w:t>- Cómo funciona: En un solo clic, crea una conversación de radio en español entre dos locutores que debaten y explican tus documentos con tono cercano y entretenido.</w:t>
             </w:r>
           </w:p>
           <w:p>
@@ -603,7 +772,7 @@
                 <w:color w:val="334155"/>
                 <w:sz w:val="19"/>
               </w:rPr>
-              <w:t>- Cómo disfrutarlo: Le das al "Play" y lo escuchas tranquilamente mientras tomas un café o descansas.</w:t>
+              <w:t>- La experiencia: Pulsas "Play", te pones cómodo y escuchas tus papeles convertidos en tertulia de sobremesa.</w:t>
             </w:r>
           </w:p>
           <w:p>
@@ -622,7 +791,7 @@
                 <w:color w:val="0F172A"/>
                 <w:sz w:val="19"/>
               </w:rPr>
-              <w:t>DIAPOSITIVA 10: CASO PRÁCTICO 1: TUS MEMORIAS Y RECETAS FAMILIARES</w:t>
+              <w:t>SLIDE 10: GUARDAR NOTAS EN STUDIO («+ AÑADIR NOTA»)</w:t>
             </w:r>
           </w:p>
           <w:p>
@@ -635,7 +804,7 @@
                 <w:color w:val="334155"/>
                 <w:sz w:val="19"/>
               </w:rPr>
-              <w:t>- Qué subes: Fotos de cuadernos viejos de cocina, recuerdos de juventud o anécdotas escritas en un folio.</w:t>
+              <w:t>- Elemento visual: El botón "+ Añadir nota" en Studio.</w:t>
             </w:r>
           </w:p>
           <w:p>
@@ -648,7 +817,7 @@
                 <w:color w:val="334155"/>
                 <w:sz w:val="19"/>
               </w:rPr>
-              <w:t>- Qué te da: Un recetario ordenado por platos, o un relato continuo de tu vida para regalar a tus hijos y nietos.</w:t>
+              <w:t>- Utilidad: Si una respuesta del chat te gusta mucho, pulsas "Guardar en nota" y se queda archivada en tu panel derecho como un post-it permanente que nunca se pierde.</w:t>
             </w:r>
           </w:p>
           <w:p>
@@ -667,7 +836,7 @@
                 <w:color w:val="0F172A"/>
                 <w:sz w:val="19"/>
               </w:rPr>
-              <w:t>DIAPOSITIVA 11: CASO PRÁCTICO 2: INFORMES MÉDICOS Y PAPELES DE CASA</w:t>
+              <w:t>SLIDE 11: PRIVACIDAD Y CONTROL TOTAL DE TUS DATOS</w:t>
             </w:r>
           </w:p>
           <w:p>
@@ -680,7 +849,7 @@
                 <w:color w:val="334155"/>
                 <w:sz w:val="19"/>
               </w:rPr>
-              <w:t>- Qué subes: El PDF de un análisis de sangre, el contrato de la luz o la carta del banco.</w:t>
+              <w:t>- Tus papeles no se comparten: Google no utiliza tus documentos personales para entrenar modelos públicos de inteligencia artificial.</w:t>
             </w:r>
           </w:p>
           <w:p>
@@ -693,20 +862,7 @@
                 <w:color w:val="334155"/>
                 <w:sz w:val="19"/>
               </w:rPr>
-              <w:t>- Qué le pides: "Explícame en palabras sencillas qué significa este informe para que lo entienda sin tecnicismos".</w:t>
-            </w:r>
-          </w:p>
-          <w:p>
-            <w:pPr>
-              <w:spacing w:line="276" w:lineRule="auto" w:after="40"/>
-            </w:pPr>
-            <w:r>
-              <w:rPr>
-                <w:rFonts w:ascii="Consolas" w:hAnsi="Consolas"/>
-                <w:color w:val="334155"/>
-                <w:sz w:val="19"/>
-              </w:rPr>
-              <w:t>- Privacidad total: Tus documentos son solo tuyos y privados; nadie más puede verlos.</w:t>
+              <w:t>- Borrado sencillo: Puedes eliminar cualquier fuente o cuaderno entero con los tres puntitos cuando termines tu consulta.</w:t>
             </w:r>
           </w:p>
           <w:p>
@@ -725,7 +881,7 @@
                 <w:color w:val="0F172A"/>
                 <w:sz w:val="19"/>
               </w:rPr>
-              <w:t>DIAPOSITIVA 12: LAS 3 REGLAS DE ORO DE NOTEBOOKLM</w:t>
+              <w:t>SLIDE 12: LAS 3 REGLAS DE ORO DE NOTEBOOKLM EN CLASE</w:t>
             </w:r>
           </w:p>
           <w:p>
@@ -738,7 +894,7 @@
                 <w:color w:val="334155"/>
                 <w:sz w:val="19"/>
               </w:rPr>
-              <w:t>- 1ª Regla: Cuanto mejor y más claro sea el documento que subas, mejor te ayudará.</w:t>
+              <w:t>- 1ª Regla: La calidad de la respuesta depende de la calidad de tus fuentes.</w:t>
             </w:r>
           </w:p>
           <w:p>
@@ -751,7 +907,7 @@
                 <w:color w:val="334155"/>
                 <w:sz w:val="19"/>
               </w:rPr>
-              <w:t>- 2ª Regla: Comprueba siempre las citas [1] para ver el papel original.</w:t>
+              <w:t>- 2ª Regla: Pulsa siempre las citas [1] para ver el papel de origen.</w:t>
             </w:r>
           </w:p>
           <w:p>
@@ -764,7 +920,7 @@
                 <w:color w:val="334155"/>
                 <w:sz w:val="19"/>
               </w:rPr>
-              <w:t>- 3ª Regla: Disfruta escuchando tus audios como si tuvieras tu propia emisora de radio en casa.</w:t>
+              <w:t>- 3ª Regla: Explora Studio sin miedo: genera resúmenes y escucha tus audios cuantas veces quieras.</w:t>
             </w:r>
           </w:p>
         </w:tc>

</xml_diff>